<commit_message>
fix(docs): install microsoft fonts for perfect PDF rendering
</commit_message>
<xml_diff>
--- a/src/templates/Domanda_di_ammissione_TEMPLATE.docx
+++ b/src/templates/Domanda_di_ammissione_TEMPLATE.docx
@@ -37,11 +37,11 @@
             <wp:effectExtent l="0" t="0" r="0" b="0"/>
             <wp:wrapTight wrapText="bothSides">
               <wp:wrapPolygon edited="0">
-                <wp:start x="-133" y="0"/>
-                <wp:lineTo x="-133" y="21413"/>
-                <wp:lineTo x="21571" y="21413"/>
-                <wp:lineTo x="21571" y="0"/>
-                <wp:lineTo x="-133" y="0"/>
+                <wp:start x="-130" y="0"/>
+                <wp:lineTo x="-130" y="21409"/>
+                <wp:lineTo x="21565" y="21409"/>
+                <wp:lineTo x="21565" y="0"/>
+                <wp:lineTo x="-130" y="0"/>
               </wp:wrapPolygon>
             </wp:wrapTight>
             <wp:docPr id="1" name="Immagine1" descr=""/>
@@ -211,7 +211,20 @@
           <w:szCs w:val="26"/>
           <w:lang w:val="it-IT" w:eastAsia="zh-CN" w:bidi="ar-SA"/>
         </w:rPr>
-        <w:t>o {{stagione}}</w:t>
+        <w:t xml:space="preserve">o </w:t>
+      </w:r>
+      <w:r>
+        <w:rPr>
+          <w:rFonts w:eastAsia="Times New Roman" w:cs="Calibri" w:ascii="Calibri" w:hAnsi="Calibri"/>
+          <w:b/>
+          <w:smallCaps/>
+          <w:color w:val="943634"/>
+          <w:kern w:val="0"/>
+          <w:sz w:val="32"/>
+          <w:szCs w:val="32"/>
+          <w:lang w:val="it-IT" w:eastAsia="zh-CN" w:bidi="ar-SA"/>
+        </w:rPr>
+        <w:t>{{stagione}}</w:t>
       </w:r>
     </w:p>
     <w:p>

</xml_diff>